<commit_message>
Reformat experiment report to match the AI lab report template (cover page, 三线表, figure/table captions)
</commit_message>
<xml_diff>
--- a/report/MNIST_CNN_实验报告.docx
+++ b/report/MNIST_CNN_实验报告.docx
@@ -2,6 +2,10 @@
 <file path=word/document.xml><?xml version="1.0" encoding="utf-8"?>
 <w:document xmlns:wpc="http://schemas.microsoft.com/office/word/2010/wordprocessingCanvas" xmlns:mo="http://schemas.microsoft.com/office/mac/office/2008/main" xmlns:mc="http://schemas.openxmlformats.org/markup-compatibility/2006" xmlns:mv="urn:schemas-microsoft-com:mac:vml" xmlns:o="urn:schemas-microsoft-com:office:office" xmlns:r="http://schemas.openxmlformats.org/officeDocument/2006/relationships" xmlns:m="http://schemas.openxmlformats.org/officeDocument/2006/math" xmlns:v="urn:schemas-microsoft-com:vml" xmlns:wp14="http://schemas.microsoft.com/office/word/2010/wordprocessingDrawing" xmlns:wp="http://schemas.openxmlformats.org/drawingml/2006/wordprocessingDrawing" xmlns:w10="urn:schemas-microsoft-com:office:word" xmlns:w="http://schemas.openxmlformats.org/wordprocessingml/2006/main" xmlns:w14="http://schemas.microsoft.com/office/word/2010/wordml" xmlns:wpg="http://schemas.microsoft.com/office/word/2010/wordprocessingGroup" xmlns:wpi="http://schemas.microsoft.com/office/word/2010/wordprocessingInk" xmlns:wne="http://schemas.microsoft.com/office/word/2006/wordml" xmlns:wps="http://schemas.microsoft.com/office/word/2010/wordprocessingShape" mc:Ignorable="w14 wp14">
   <w:body>
+    <w:p/>
+    <w:p/>
+    <w:p/>
+    <w:p/>
     <w:p>
       <w:pPr>
         <w:jc w:val="center"/>
@@ -10,195 +14,14 @@
         <w:rPr>
           <w:rFonts w:ascii="Times New Roman" w:hAnsi="Times New Roman" w:eastAsia="宋体"/>
           <w:b/>
-          <w:sz w:val="36"/>
+          <w:sz w:val="52"/>
         </w:rPr>
-        <w:t>实验二　基于卷积神经网络的 MNIST 手写数字识别</w:t>
+        <w:t>人工智能技术及应用实验报告</w:t>
       </w:r>
     </w:p>
-    <w:tbl>
-      <w:tblPr>
-        <w:tblStyle w:val="LightGrid-Accent1"/>
-        <w:tblW w:type="auto" w:w="0"/>
-        <w:tblLook w:firstColumn="1" w:firstRow="1" w:lastColumn="0" w:lastRow="0" w:noHBand="0" w:noVBand="1" w:val="04A0"/>
-      </w:tblPr>
-      <w:tblGrid>
-        <w:gridCol w:w="4320"/>
-        <w:gridCol w:w="4320"/>
-      </w:tblGrid>
-      <w:tr>
-        <w:tc>
-          <w:tcPr>
-            <w:tcW w:type="dxa" w:w="4320"/>
-          </w:tcPr>
-          <w:p>
-            <w:r/>
-            <w:r>
-              <w:rPr>
-                <w:rFonts w:ascii="Times New Roman" w:hAnsi="Times New Roman" w:eastAsia="宋体"/>
-                <w:b/>
-                <w:sz w:val="21"/>
-              </w:rPr>
-              <w:t>实验名称</w:t>
-            </w:r>
-          </w:p>
-        </w:tc>
-        <w:tc>
-          <w:tcPr>
-            <w:tcW w:type="dxa" w:w="4320"/>
-          </w:tcPr>
-          <w:p>
-            <w:r/>
-            <w:r>
-              <w:rPr>
-                <w:rFonts w:ascii="Times New Roman" w:hAnsi="Times New Roman" w:eastAsia="宋体"/>
-                <w:b/>
-                <w:sz w:val="21"/>
-              </w:rPr>
-              <w:t>基于卷积神经网络的 MNIST 手写数字识别</w:t>
-            </w:r>
-          </w:p>
-        </w:tc>
-      </w:tr>
-      <w:tr>
-        <w:tc>
-          <w:tcPr>
-            <w:tcW w:type="dxa" w:w="4320"/>
-          </w:tcPr>
-          <w:p>
-            <w:r/>
-            <w:r>
-              <w:rPr>
-                <w:rFonts w:ascii="Times New Roman" w:hAnsi="Times New Roman" w:eastAsia="宋体"/>
-                <w:b w:val="0"/>
-                <w:sz w:val="21"/>
-              </w:rPr>
-              <w:t>专业班级</w:t>
-            </w:r>
-          </w:p>
-        </w:tc>
-        <w:tc>
-          <w:tcPr>
-            <w:tcW w:type="dxa" w:w="4320"/>
-          </w:tcPr>
-          <w:p>
-            <w:r/>
-            <w:r>
-              <w:rPr>
-                <w:rFonts w:ascii="Times New Roman" w:hAnsi="Times New Roman" w:eastAsia="宋体"/>
-                <w:b w:val="0"/>
-                <w:sz w:val="21"/>
-              </w:rPr>
-              <w:t>（请填写）</w:t>
-            </w:r>
-          </w:p>
-        </w:tc>
-      </w:tr>
-      <w:tr>
-        <w:tc>
-          <w:tcPr>
-            <w:tcW w:type="dxa" w:w="4320"/>
-          </w:tcPr>
-          <w:p>
-            <w:r/>
-            <w:r>
-              <w:rPr>
-                <w:rFonts w:ascii="Times New Roman" w:hAnsi="Times New Roman" w:eastAsia="宋体"/>
-                <w:b w:val="0"/>
-                <w:sz w:val="21"/>
-              </w:rPr>
-              <w:t>学号</w:t>
-            </w:r>
-          </w:p>
-        </w:tc>
-        <w:tc>
-          <w:tcPr>
-            <w:tcW w:type="dxa" w:w="4320"/>
-          </w:tcPr>
-          <w:p>
-            <w:r/>
-            <w:r>
-              <w:rPr>
-                <w:rFonts w:ascii="Times New Roman" w:hAnsi="Times New Roman" w:eastAsia="宋体"/>
-                <w:b w:val="0"/>
-                <w:sz w:val="21"/>
-              </w:rPr>
-              <w:t>（请填写）</w:t>
-            </w:r>
-          </w:p>
-        </w:tc>
-      </w:tr>
-      <w:tr>
-        <w:tc>
-          <w:tcPr>
-            <w:tcW w:type="dxa" w:w="4320"/>
-          </w:tcPr>
-          <w:p>
-            <w:r/>
-            <w:r>
-              <w:rPr>
-                <w:rFonts w:ascii="Times New Roman" w:hAnsi="Times New Roman" w:eastAsia="宋体"/>
-                <w:b w:val="0"/>
-                <w:sz w:val="21"/>
-              </w:rPr>
-              <w:t>姓名</w:t>
-            </w:r>
-          </w:p>
-        </w:tc>
-        <w:tc>
-          <w:tcPr>
-            <w:tcW w:type="dxa" w:w="4320"/>
-          </w:tcPr>
-          <w:p>
-            <w:r/>
-            <w:r>
-              <w:rPr>
-                <w:rFonts w:ascii="Times New Roman" w:hAnsi="Times New Roman" w:eastAsia="宋体"/>
-                <w:b w:val="0"/>
-                <w:sz w:val="21"/>
-              </w:rPr>
-              <w:t>（请填写）</w:t>
-            </w:r>
-          </w:p>
-        </w:tc>
-      </w:tr>
-      <w:tr>
-        <w:tc>
-          <w:tcPr>
-            <w:tcW w:type="dxa" w:w="4320"/>
-          </w:tcPr>
-          <w:p>
-            <w:r/>
-            <w:r>
-              <w:rPr>
-                <w:rFonts w:ascii="Times New Roman" w:hAnsi="Times New Roman" w:eastAsia="宋体"/>
-                <w:b w:val="0"/>
-                <w:sz w:val="21"/>
-              </w:rPr>
-              <w:t>实验日期</w:t>
-            </w:r>
-          </w:p>
-        </w:tc>
-        <w:tc>
-          <w:tcPr>
-            <w:tcW w:type="dxa" w:w="4320"/>
-          </w:tcPr>
-          <w:p>
-            <w:r/>
-            <w:r>
-              <w:rPr>
-                <w:rFonts w:ascii="Times New Roman" w:hAnsi="Times New Roman" w:eastAsia="宋体"/>
-                <w:b w:val="0"/>
-                <w:sz w:val="21"/>
-              </w:rPr>
-              <w:t>（请填写）</w:t>
-            </w:r>
-          </w:p>
-        </w:tc>
-      </w:tr>
-    </w:tbl>
     <w:p>
       <w:pPr>
-        <w:pStyle w:val="Heading1"/>
+        <w:jc w:val="center"/>
       </w:pPr>
       <w:r>
         <w:rPr>
@@ -206,131 +29,19 @@
           <w:b/>
           <w:sz w:val="32"/>
         </w:rPr>
-        <w:t>一、实验目的</w:t>
+        <w:t>（2026年）</w:t>
       </w:r>
     </w:p>
-    <w:p>
-      <w:r>
-        <w:rPr>
-          <w:rFonts w:ascii="Times New Roman" w:hAnsi="Times New Roman" w:eastAsia="宋体"/>
-          <w:b w:val="0"/>
-          <w:sz w:val="24"/>
-        </w:rPr>
-        <w:t>1. 熟悉 PyTorch 深度学习框架的使用；</w:t>
-      </w:r>
-    </w:p>
-    <w:p>
-      <w:r>
-        <w:rPr>
-          <w:rFonts w:ascii="Times New Roman" w:hAnsi="Times New Roman" w:eastAsia="宋体"/>
-          <w:b w:val="0"/>
-          <w:sz w:val="24"/>
-        </w:rPr>
-        <w:t>2. 熟悉卷积神经网络（CNN）的训练思路；</w:t>
-      </w:r>
-    </w:p>
-    <w:p>
-      <w:r>
-        <w:rPr>
-          <w:rFonts w:ascii="Times New Roman" w:hAnsi="Times New Roman" w:eastAsia="宋体"/>
-          <w:b w:val="0"/>
-          <w:sz w:val="24"/>
-        </w:rPr>
-        <w:t>3. 掌握卷积神经网络对 MNIST 手写数字的识别过程。</w:t>
-      </w:r>
-    </w:p>
+    <w:p/>
+    <w:p/>
+    <w:p/>
+    <w:p/>
+    <w:p/>
+    <w:p/>
     <w:p>
       <w:pPr>
-        <w:pStyle w:val="Heading1"/>
-      </w:pPr>
-      <w:r>
-        <w:rPr>
-          <w:rFonts w:ascii="Times New Roman" w:hAnsi="Times New Roman" w:eastAsia="宋体"/>
-          <w:b/>
-          <w:sz w:val="32"/>
-        </w:rPr>
-        <w:t>二、实验内容</w:t>
-      </w:r>
-    </w:p>
-    <w:p>
-      <w:r>
-        <w:rPr>
-          <w:rFonts w:ascii="Times New Roman" w:hAnsi="Times New Roman" w:eastAsia="宋体"/>
-          <w:b w:val="0"/>
-          <w:sz w:val="24"/>
-        </w:rPr>
-        <w:t>MNIST 数据库共有 7 万张手写数字图片，其中 6 万张用于训练、1 万张用于测试，每张图片大小为 28×28 像素（单通道灰度图），标签为 0~9 共 10 类。本实验使用 PyTorch 搭建一个卷积神经网络模型，完成对 MNIST 手写数字的识别任务，并对训练、测试结果进行分析。</w:t>
-      </w:r>
-    </w:p>
-    <w:p>
-      <w:pPr>
-        <w:pStyle w:val="Heading1"/>
-      </w:pPr>
-      <w:r>
-        <w:rPr>
-          <w:rFonts w:ascii="Times New Roman" w:hAnsi="Times New Roman" w:eastAsia="宋体"/>
-          <w:b/>
-          <w:sz w:val="32"/>
-        </w:rPr>
-        <w:t>三、实验设备与环境</w:t>
-      </w:r>
-    </w:p>
-    <w:p>
-      <w:r>
-        <w:rPr>
-          <w:rFonts w:ascii="Times New Roman" w:hAnsi="Times New Roman" w:eastAsia="宋体"/>
-          <w:b w:val="0"/>
-          <w:sz w:val="24"/>
-        </w:rPr>
-        <w:t>1. 计算机一台；</w:t>
-      </w:r>
-    </w:p>
-    <w:p>
-      <w:r>
-        <w:rPr>
-          <w:rFonts w:ascii="Times New Roman" w:hAnsi="Times New Roman" w:eastAsia="宋体"/>
-          <w:b w:val="0"/>
-          <w:sz w:val="24"/>
-        </w:rPr>
-        <w:t>2. PyTorch 深度学习框架；</w:t>
-      </w:r>
-    </w:p>
-    <w:p>
-      <w:r>
-        <w:rPr>
-          <w:rFonts w:ascii="Times New Roman" w:hAnsi="Times New Roman" w:eastAsia="宋体"/>
-          <w:b w:val="0"/>
-          <w:sz w:val="24"/>
-        </w:rPr>
-        <w:t>3. 具体环境：Python 3.12 + torch 2.12.0(CPU) + torchvision 0.27.0 + matplotlib。</w:t>
-      </w:r>
-    </w:p>
-    <w:p>
-      <w:pPr>
-        <w:pStyle w:val="Heading1"/>
-      </w:pPr>
-      <w:r>
-        <w:rPr>
-          <w:rFonts w:ascii="Times New Roman" w:hAnsi="Times New Roman" w:eastAsia="宋体"/>
-          <w:b/>
-          <w:sz w:val="32"/>
-        </w:rPr>
-        <w:t>四、实验步骤</w:t>
-      </w:r>
-    </w:p>
-    <w:p>
-      <w:r>
-        <w:rPr>
-          <w:rFonts w:ascii="Times New Roman" w:hAnsi="Times New Roman" w:eastAsia="宋体"/>
-          <w:b w:val="0"/>
-          <w:sz w:val="24"/>
-        </w:rPr>
-        <w:t>实验按「读取数据 → 创建模型 → 训练网络 → 测试网络 → 结果输出与分析」五个步骤进行，对应代码见 train_mnist_cnn.py。</w:t>
-      </w:r>
-    </w:p>
-    <w:p>
-      <w:pPr>
-        <w:pStyle w:val="Heading2"/>
+        <w:spacing w:line="480" w:lineRule="auto"/>
+        <w:jc w:val="center"/>
       </w:pPr>
       <w:r>
         <w:rPr>
@@ -338,52 +49,22 @@
           <w:b/>
           <w:sz w:val="28"/>
         </w:rPr>
-        <w:t>4.1 读取数据（输入数据与目标输出数据）</w:t>
+        <w:t>实 验 名 称 ：</w:t>
       </w:r>
-    </w:p>
-    <w:p>
       <w:r>
         <w:rPr>
           <w:rFonts w:ascii="Times New Roman" w:hAnsi="Times New Roman" w:eastAsia="宋体"/>
           <w:b w:val="0"/>
-          <w:sz w:val="24"/>
+          <w:sz w:val="28"/>
+          <w:u w:val="single"/>
         </w:rPr>
-        <w:t>· 使用 torchvision.datasets.MNIST 自动下载并加载训练集(60000 张)与测试集(10000 张)。</w:t>
-      </w:r>
-    </w:p>
-    <w:p>
-      <w:r>
-        <w:rPr>
-          <w:rFonts w:ascii="Times New Roman" w:hAnsi="Times New Roman" w:eastAsia="宋体"/>
-          <w:b w:val="0"/>
-          <w:sz w:val="24"/>
-        </w:rPr>
-        <w:t>· 预处理：ToTensor() 归一化到 [0,1]，再用 Normalize((0.1307,),(0.3081,)) 做标准化。</w:t>
-      </w:r>
-    </w:p>
-    <w:p>
-      <w:r>
-        <w:rPr>
-          <w:rFonts w:ascii="Times New Roman" w:hAnsi="Times New Roman" w:eastAsia="宋体"/>
-          <w:b w:val="0"/>
-          <w:sz w:val="24"/>
-        </w:rPr>
-        <w:t>· 训练集 batch_size=64 且 shuffle=True；测试集 batch_size=1000 不打乱。</w:t>
-      </w:r>
-    </w:p>
-    <w:p>
-      <w:r>
-        <w:rPr>
-          <w:rFonts w:ascii="Times New Roman" w:hAnsi="Times New Roman" w:eastAsia="宋体"/>
-          <w:b w:val="0"/>
-          <w:sz w:val="24"/>
-        </w:rPr>
-        <w:t>· 输入数据为形状 [N,1,28,28] 的图像张量；目标输出为形状 [N] 的整数标签(0~9)。</w:t>
+        <w:t xml:space="preserve">　基于卷积神经网络的 MNIST 手写数字识别</w:t>
       </w:r>
     </w:p>
     <w:p>
       <w:pPr>
-        <w:pStyle w:val="Heading2"/>
+        <w:spacing w:line="480" w:lineRule="auto"/>
+        <w:jc w:val="center"/>
       </w:pPr>
       <w:r>
         <w:rPr>
@@ -391,17 +72,373 @@
           <w:b/>
           <w:sz w:val="28"/>
         </w:rPr>
-        <w:t>4.2 创建卷积神经网络模型</w:t>
+        <w:t>专 业 班 级 ：</w:t>
+      </w:r>
+      <w:r>
+        <w:rPr>
+          <w:rFonts w:ascii="Times New Roman" w:hAnsi="Times New Roman" w:eastAsia="宋体"/>
+          <w:b w:val="0"/>
+          <w:sz w:val="28"/>
+        </w:rPr>
+        <w:t xml:space="preserve">　　　　　　　　　　　　　</w:t>
       </w:r>
     </w:p>
     <w:p>
+      <w:pPr>
+        <w:spacing w:line="480" w:lineRule="auto"/>
+        <w:jc w:val="center"/>
+      </w:pPr>
+      <w:r>
+        <w:rPr>
+          <w:rFonts w:ascii="Times New Roman" w:hAnsi="Times New Roman" w:eastAsia="宋体"/>
+          <w:b/>
+          <w:sz w:val="28"/>
+        </w:rPr>
+        <w:t>学 生 姓 名 ：</w:t>
+      </w:r>
+      <w:r>
+        <w:rPr>
+          <w:rFonts w:ascii="Times New Roman" w:hAnsi="Times New Roman" w:eastAsia="宋体"/>
+          <w:b w:val="0"/>
+          <w:sz w:val="28"/>
+        </w:rPr>
+        <w:t xml:space="preserve">　　　　　　　　　　　　　</w:t>
+      </w:r>
+    </w:p>
+    <w:p>
+      <w:pPr>
+        <w:spacing w:line="480" w:lineRule="auto"/>
+        <w:jc w:val="center"/>
+      </w:pPr>
+      <w:r>
+        <w:rPr>
+          <w:rFonts w:ascii="Times New Roman" w:hAnsi="Times New Roman" w:eastAsia="宋体"/>
+          <w:b/>
+          <w:sz w:val="28"/>
+        </w:rPr>
+        <w:t>学 生 学 号 ：</w:t>
+      </w:r>
+      <w:r>
+        <w:rPr>
+          <w:rFonts w:ascii="Times New Roman" w:hAnsi="Times New Roman" w:eastAsia="宋体"/>
+          <w:b w:val="0"/>
+          <w:sz w:val="28"/>
+        </w:rPr>
+        <w:t xml:space="preserve">　　　　　　　　　　　　　</w:t>
+      </w:r>
+    </w:p>
+    <w:p>
+      <w:pPr>
+        <w:spacing w:line="480" w:lineRule="auto"/>
+        <w:jc w:val="center"/>
+      </w:pPr>
+      <w:r>
+        <w:rPr>
+          <w:rFonts w:ascii="Times New Roman" w:hAnsi="Times New Roman" w:eastAsia="宋体"/>
+          <w:b/>
+          <w:sz w:val="28"/>
+        </w:rPr>
+        <w:t>实 验 日 期 ：</w:t>
+      </w:r>
+      <w:r>
+        <w:rPr>
+          <w:rFonts w:ascii="Times New Roman" w:hAnsi="Times New Roman" w:eastAsia="宋体"/>
+          <w:b w:val="0"/>
+          <w:sz w:val="28"/>
+        </w:rPr>
+        <w:t xml:space="preserve">　　　　　　　　　　　　　</w:t>
+      </w:r>
+    </w:p>
+    <w:p>
+      <w:r>
+        <w:br w:type="page"/>
+      </w:r>
+    </w:p>
+    <w:p>
+      <w:pPr>
+        <w:spacing w:before="120" w:after="120" w:line="360" w:lineRule="auto"/>
+      </w:pPr>
+      <w:r>
+        <w:rPr>
+          <w:rFonts w:ascii="Times New Roman" w:hAnsi="Times New Roman" w:eastAsia="宋体"/>
+          <w:b/>
+          <w:sz w:val="28"/>
+        </w:rPr>
+        <w:t>1　实验目的</w:t>
+      </w:r>
+    </w:p>
+    <w:p>
+      <w:pPr>
+        <w:spacing w:before="0" w:after="0" w:line="360" w:lineRule="auto"/>
+        <w:ind w:firstLine="480"/>
+      </w:pPr>
       <w:r>
         <w:rPr>
           <w:rFonts w:ascii="Times New Roman" w:hAnsi="Times New Roman" w:eastAsia="宋体"/>
           <w:b w:val="0"/>
           <w:sz w:val="24"/>
         </w:rPr>
-        <w:t>网络结构示意图如下：</w:t>
+        <w:t>（1）熟悉 PyTorch 深度学习框架的使用；</w:t>
+      </w:r>
+    </w:p>
+    <w:p>
+      <w:pPr>
+        <w:spacing w:before="0" w:after="0" w:line="360" w:lineRule="auto"/>
+        <w:ind w:firstLine="480"/>
+      </w:pPr>
+      <w:r>
+        <w:rPr>
+          <w:rFonts w:ascii="Times New Roman" w:hAnsi="Times New Roman" w:eastAsia="宋体"/>
+          <w:b w:val="0"/>
+          <w:sz w:val="24"/>
+        </w:rPr>
+        <w:t>（2）熟悉卷积神经网络（CNN）的训练思路；</w:t>
+      </w:r>
+    </w:p>
+    <w:p>
+      <w:pPr>
+        <w:spacing w:before="0" w:after="0" w:line="360" w:lineRule="auto"/>
+        <w:ind w:firstLine="480"/>
+      </w:pPr>
+      <w:r>
+        <w:rPr>
+          <w:rFonts w:ascii="Times New Roman" w:hAnsi="Times New Roman" w:eastAsia="宋体"/>
+          <w:b w:val="0"/>
+          <w:sz w:val="24"/>
+        </w:rPr>
+        <w:t>（3）掌握卷积神经网络对 MNIST 手写数字的识别过程。</w:t>
+      </w:r>
+    </w:p>
+    <w:p>
+      <w:pPr>
+        <w:spacing w:before="120" w:after="120" w:line="360" w:lineRule="auto"/>
+      </w:pPr>
+      <w:r>
+        <w:rPr>
+          <w:rFonts w:ascii="Times New Roman" w:hAnsi="Times New Roman" w:eastAsia="宋体"/>
+          <w:b/>
+          <w:sz w:val="28"/>
+        </w:rPr>
+        <w:t>2　实验内容</w:t>
+      </w:r>
+    </w:p>
+    <w:p>
+      <w:pPr>
+        <w:spacing w:before="0" w:after="0" w:line="360" w:lineRule="auto"/>
+        <w:ind w:firstLine="480"/>
+      </w:pPr>
+      <w:r>
+        <w:rPr>
+          <w:rFonts w:ascii="Times New Roman" w:hAnsi="Times New Roman" w:eastAsia="宋体"/>
+          <w:b w:val="0"/>
+          <w:sz w:val="24"/>
+        </w:rPr>
+        <w:t>MNIST 数据库共有 7 万张手写数字图片，其中 6 万张用于训练神经网络，1 万张用于测试神经网络，每张图片大小为 28×28 像素（单通道灰度图），标签为 0~9 共 10 类。本次实验使用 PyTorch 搭建一个卷积神经网络模型，以实现 MNIST 手写数据的识别任务，并对训练、测试结果进行分析。</w:t>
+      </w:r>
+    </w:p>
+    <w:p>
+      <w:pPr>
+        <w:spacing w:before="120" w:after="120" w:line="360" w:lineRule="auto"/>
+      </w:pPr>
+      <w:r>
+        <w:rPr>
+          <w:rFonts w:ascii="Times New Roman" w:hAnsi="Times New Roman" w:eastAsia="宋体"/>
+          <w:b/>
+          <w:sz w:val="28"/>
+        </w:rPr>
+        <w:t>3　实验步骤</w:t>
+      </w:r>
+    </w:p>
+    <w:p>
+      <w:pPr>
+        <w:spacing w:before="0" w:after="0" w:line="360" w:lineRule="auto"/>
+        <w:ind w:firstLine="480"/>
+      </w:pPr>
+      <w:r>
+        <w:rPr>
+          <w:rFonts w:ascii="Times New Roman" w:hAnsi="Times New Roman" w:eastAsia="宋体"/>
+          <w:b w:val="0"/>
+          <w:sz w:val="24"/>
+        </w:rPr>
+        <w:t>（1）读取数据（输入数据与目标输出数据）；</w:t>
+      </w:r>
+    </w:p>
+    <w:p>
+      <w:pPr>
+        <w:spacing w:before="0" w:after="0" w:line="360" w:lineRule="auto"/>
+        <w:ind w:firstLine="480"/>
+      </w:pPr>
+      <w:r>
+        <w:rPr>
+          <w:rFonts w:ascii="Times New Roman" w:hAnsi="Times New Roman" w:eastAsia="宋体"/>
+          <w:b w:val="0"/>
+          <w:sz w:val="24"/>
+        </w:rPr>
+        <w:t>（2）创建卷积神经网络模型；</w:t>
+      </w:r>
+    </w:p>
+    <w:p>
+      <w:pPr>
+        <w:spacing w:before="0" w:after="0" w:line="360" w:lineRule="auto"/>
+        <w:ind w:firstLine="480"/>
+      </w:pPr>
+      <w:r>
+        <w:rPr>
+          <w:rFonts w:ascii="Times New Roman" w:hAnsi="Times New Roman" w:eastAsia="宋体"/>
+          <w:b w:val="0"/>
+          <w:sz w:val="24"/>
+        </w:rPr>
+        <w:t>（3）训练网络；</w:t>
+      </w:r>
+    </w:p>
+    <w:p>
+      <w:pPr>
+        <w:spacing w:before="0" w:after="0" w:line="360" w:lineRule="auto"/>
+        <w:ind w:firstLine="480"/>
+      </w:pPr>
+      <w:r>
+        <w:rPr>
+          <w:rFonts w:ascii="Times New Roman" w:hAnsi="Times New Roman" w:eastAsia="宋体"/>
+          <w:b w:val="0"/>
+          <w:sz w:val="24"/>
+        </w:rPr>
+        <w:t>（4）测试网络；</w:t>
+      </w:r>
+    </w:p>
+    <w:p>
+      <w:pPr>
+        <w:spacing w:before="0" w:after="0" w:line="360" w:lineRule="auto"/>
+        <w:ind w:firstLine="480"/>
+      </w:pPr>
+      <w:r>
+        <w:rPr>
+          <w:rFonts w:ascii="Times New Roman" w:hAnsi="Times New Roman" w:eastAsia="宋体"/>
+          <w:b w:val="0"/>
+          <w:sz w:val="24"/>
+        </w:rPr>
+        <w:t>（5）结果输出与分析。</w:t>
+      </w:r>
+    </w:p>
+    <w:p>
+      <w:pPr>
+        <w:spacing w:before="120" w:after="120" w:line="360" w:lineRule="auto"/>
+      </w:pPr>
+      <w:r>
+        <w:rPr>
+          <w:rFonts w:ascii="Times New Roman" w:hAnsi="Times New Roman" w:eastAsia="宋体"/>
+          <w:b/>
+          <w:sz w:val="28"/>
+        </w:rPr>
+        <w:t>4　实验设备</w:t>
+      </w:r>
+    </w:p>
+    <w:p>
+      <w:pPr>
+        <w:spacing w:before="0" w:after="0" w:line="360" w:lineRule="auto"/>
+        <w:ind w:firstLine="480"/>
+      </w:pPr>
+      <w:r>
+        <w:rPr>
+          <w:rFonts w:ascii="Times New Roman" w:hAnsi="Times New Roman" w:eastAsia="宋体"/>
+          <w:b w:val="0"/>
+          <w:sz w:val="24"/>
+        </w:rPr>
+        <w:t>（1）计算机；</w:t>
+      </w:r>
+    </w:p>
+    <w:p>
+      <w:pPr>
+        <w:spacing w:before="0" w:after="0" w:line="360" w:lineRule="auto"/>
+        <w:ind w:firstLine="480"/>
+      </w:pPr>
+      <w:r>
+        <w:rPr>
+          <w:rFonts w:ascii="Times New Roman" w:hAnsi="Times New Roman" w:eastAsia="宋体"/>
+          <w:b w:val="0"/>
+          <w:sz w:val="24"/>
+        </w:rPr>
+        <w:t>（2）PyTorch 深度学习框架；</w:t>
+      </w:r>
+    </w:p>
+    <w:p>
+      <w:pPr>
+        <w:spacing w:before="0" w:after="0" w:line="360" w:lineRule="auto"/>
+        <w:ind w:firstLine="480"/>
+      </w:pPr>
+      <w:r>
+        <w:rPr>
+          <w:rFonts w:ascii="Times New Roman" w:hAnsi="Times New Roman" w:eastAsia="宋体"/>
+          <w:b w:val="0"/>
+          <w:sz w:val="24"/>
+        </w:rPr>
+        <w:t>（3）软件环境：Python 3.12 + torch 2.12.0（CPU）+ torchvision 0.27.0 + matplotlib。</w:t>
+      </w:r>
+    </w:p>
+    <w:p>
+      <w:pPr>
+        <w:spacing w:before="120" w:after="120" w:line="360" w:lineRule="auto"/>
+      </w:pPr>
+      <w:r>
+        <w:rPr>
+          <w:rFonts w:ascii="Times New Roman" w:hAnsi="Times New Roman" w:eastAsia="宋体"/>
+          <w:b/>
+          <w:sz w:val="28"/>
+        </w:rPr>
+        <w:t>5　实验过程</w:t>
+      </w:r>
+    </w:p>
+    <w:p>
+      <w:pPr>
+        <w:spacing w:before="120" w:after="120" w:line="360" w:lineRule="auto"/>
+      </w:pPr>
+      <w:r>
+        <w:rPr>
+          <w:rFonts w:ascii="Times New Roman" w:hAnsi="Times New Roman" w:eastAsia="宋体"/>
+          <w:b/>
+          <w:sz w:val="24"/>
+        </w:rPr>
+        <w:t>5.1　读取数据</w:t>
+      </w:r>
+    </w:p>
+    <w:p>
+      <w:pPr>
+        <w:spacing w:before="0" w:after="0" w:line="360" w:lineRule="auto"/>
+        <w:ind w:firstLine="480"/>
+      </w:pPr>
+      <w:r>
+        <w:rPr>
+          <w:rFonts w:ascii="Times New Roman" w:hAnsi="Times New Roman" w:eastAsia="宋体"/>
+          <w:b w:val="0"/>
+          <w:sz w:val="24"/>
+        </w:rPr>
+        <w:t>使用 torchvision.datasets.MNIST 自动下载并加载训练集（60000 张）与测试集（10000 张）。预处理时先用 ToTensor() 将像素归一化到 [0,1]，再用 MNIST 全局均值/标准差 Normalize((0.1307,),(0.3081,)) 做标准化，使输入分布更稳定、收敛更快。训练集 batch_size=64 且随机打乱，测试集 batch_size=1000。输入数据为形状 [N,1,28,28] 的图像张量，目标输出为形状 [N] 的整数标签（0~9）。</w:t>
+      </w:r>
+    </w:p>
+    <w:p>
+      <w:pPr>
+        <w:spacing w:before="120" w:after="120" w:line="360" w:lineRule="auto"/>
+      </w:pPr>
+      <w:r>
+        <w:rPr>
+          <w:rFonts w:ascii="Times New Roman" w:hAnsi="Times New Roman" w:eastAsia="宋体"/>
+          <w:b/>
+          <w:sz w:val="24"/>
+        </w:rPr>
+        <w:t>5.2　创建卷积神经网络模型</w:t>
+      </w:r>
+    </w:p>
+    <w:p>
+      <w:pPr>
+        <w:spacing w:before="0" w:after="0" w:line="360" w:lineRule="auto"/>
+        <w:ind w:firstLine="480"/>
+      </w:pPr>
+      <w:r>
+        <w:rPr>
+          <w:rFonts w:ascii="Times New Roman" w:hAnsi="Times New Roman" w:eastAsia="宋体"/>
+          <w:b w:val="0"/>
+          <w:sz w:val="24"/>
+        </w:rPr>
+        <w:t>本实验搭建的卷积神经网络结构示意图如图 1 所示，各层配置如表 1 所示。</w:t>
       </w:r>
     </w:p>
     <w:p>
@@ -411,7 +448,7 @@
       <w:r>
         <w:drawing>
           <wp:inline xmlns:a="http://schemas.openxmlformats.org/drawingml/2006/main" xmlns:pic="http://schemas.openxmlformats.org/drawingml/2006/picture">
-            <wp:extent cx="5943600" cy="1228610"/>
+            <wp:extent cx="5852160" cy="1209708"/>
             <wp:docPr id="1" name="Picture 1"/>
             <wp:cNvGraphicFramePr>
               <a:graphicFrameLocks noChangeAspect="1"/>
@@ -432,7 +469,7 @@
                   <pic:spPr>
                     <a:xfrm>
                       <a:off x="0" y="0"/>
-                      <a:ext cx="5943600" cy="1228610"/>
+                      <a:ext cx="5852160" cy="1209708"/>
                     </a:xfrm>
                     <a:prstGeom prst="rect"/>
                   </pic:spPr>
@@ -445,23 +482,45 @@
     </w:p>
     <w:p>
       <w:pPr>
+        <w:spacing w:before="40" w:after="120"/>
         <w:jc w:val="center"/>
       </w:pPr>
       <w:r>
         <w:rPr>
           <w:rFonts w:ascii="Times New Roman" w:hAnsi="Times New Roman" w:eastAsia="宋体"/>
-          <w:b w:val="0"/>
-          <w:i/>
+          <w:b/>
           <w:sz w:val="21"/>
         </w:rPr>
-        <w:t>图1 CNN 网络结构示意图</w:t>
+        <w:t>图 1　CNN 网络结构示意图</w:t>
+      </w:r>
+    </w:p>
+    <w:p>
+      <w:pPr>
+        <w:spacing w:before="120" w:after="40"/>
+        <w:jc w:val="center"/>
+      </w:pPr>
+      <w:r>
+        <w:rPr>
+          <w:rFonts w:ascii="Times New Roman" w:hAnsi="Times New Roman" w:eastAsia="宋体"/>
+          <w:b/>
+          <w:sz w:val="21"/>
+        </w:rPr>
+        <w:t>表 1　网络各层配置</w:t>
       </w:r>
     </w:p>
     <w:tbl>
       <w:tblPr>
-        <w:tblStyle w:val="LightGrid-Accent1"/>
         <w:tblW w:type="auto" w:w="0"/>
+        <w:jc w:val="center"/>
         <w:tblLook w:firstColumn="1" w:firstRow="1" w:lastColumn="0" w:lastRow="0" w:noHBand="0" w:noVBand="1" w:val="04A0"/>
+        <w:tblBorders>
+          <w:top w:val="single" w:sz="12" w:space="0" w:color="000000"/>
+          <w:bottom w:val="single" w:sz="12" w:space="0" w:color="000000"/>
+          <w:left w:val="none" w:sz="0" w:space="0" w:color="000000"/>
+          <w:right w:val="none" w:sz="0" w:space="0" w:color="000000"/>
+          <w:insideV w:val="none" w:sz="0" w:space="0" w:color="000000"/>
+          <w:insideH w:val="none" w:sz="0" w:space="0" w:color="000000"/>
+        </w:tblBorders>
       </w:tblPr>
       <w:tblGrid>
         <w:gridCol w:w="2880"/>
@@ -472,8 +531,14 @@
         <w:tc>
           <w:tcPr>
             <w:tcW w:type="dxa" w:w="2880"/>
+            <w:tcBorders>
+              <w:bottom w:val="single" w:sz="6" w:space="0" w:color="000000"/>
+            </w:tcBorders>
           </w:tcPr>
           <w:p>
+            <w:pPr>
+              <w:jc w:val="center"/>
+            </w:pPr>
             <w:r/>
             <w:r>
               <w:rPr>
@@ -488,8 +553,14 @@
         <w:tc>
           <w:tcPr>
             <w:tcW w:type="dxa" w:w="2880"/>
+            <w:tcBorders>
+              <w:bottom w:val="single" w:sz="6" w:space="0" w:color="000000"/>
+            </w:tcBorders>
           </w:tcPr>
           <w:p>
+            <w:pPr>
+              <w:jc w:val="center"/>
+            </w:pPr>
             <w:r/>
             <w:r>
               <w:rPr>
@@ -504,8 +575,14 @@
         <w:tc>
           <w:tcPr>
             <w:tcW w:type="dxa" w:w="2880"/>
+            <w:tcBorders>
+              <w:bottom w:val="single" w:sz="6" w:space="0" w:color="000000"/>
+            </w:tcBorders>
           </w:tcPr>
           <w:p>
+            <w:pPr>
+              <w:jc w:val="center"/>
+            </w:pPr>
             <w:r/>
             <w:r>
               <w:rPr>
@@ -524,6 +601,9 @@
             <w:tcW w:type="dxa" w:w="2880"/>
           </w:tcPr>
           <w:p>
+            <w:pPr>
+              <w:jc w:val="center"/>
+            </w:pPr>
             <w:r/>
             <w:r>
               <w:rPr>
@@ -540,6 +620,9 @@
             <w:tcW w:type="dxa" w:w="2880"/>
           </w:tcPr>
           <w:p>
+            <w:pPr>
+              <w:jc w:val="center"/>
+            </w:pPr>
             <w:r/>
             <w:r>
               <w:rPr>
@@ -556,6 +639,9 @@
             <w:tcW w:type="dxa" w:w="2880"/>
           </w:tcPr>
           <w:p>
+            <w:pPr>
+              <w:jc w:val="center"/>
+            </w:pPr>
             <w:r/>
             <w:r>
               <w:rPr>
@@ -563,7 +649,7 @@
                 <w:b w:val="0"/>
                 <w:sz w:val="21"/>
               </w:rPr>
-              <w:t>1 × 28 × 28</w:t>
+              <w:t>1×28×28</w:t>
             </w:r>
           </w:p>
         </w:tc>
@@ -574,6 +660,9 @@
             <w:tcW w:type="dxa" w:w="2880"/>
           </w:tcPr>
           <w:p>
+            <w:pPr>
+              <w:jc w:val="center"/>
+            </w:pPr>
             <w:r/>
             <w:r>
               <w:rPr>
@@ -590,6 +679,9 @@
             <w:tcW w:type="dxa" w:w="2880"/>
           </w:tcPr>
           <w:p>
+            <w:pPr>
+              <w:jc w:val="center"/>
+            </w:pPr>
             <w:r/>
             <w:r>
               <w:rPr>
@@ -606,6 +698,9 @@
             <w:tcW w:type="dxa" w:w="2880"/>
           </w:tcPr>
           <w:p>
+            <w:pPr>
+              <w:jc w:val="center"/>
+            </w:pPr>
             <w:r/>
             <w:r>
               <w:rPr>
@@ -613,7 +708,7 @@
                 <w:b w:val="0"/>
                 <w:sz w:val="21"/>
               </w:rPr>
-              <w:t>32 × 28 × 28</w:t>
+              <w:t>32×28×28</w:t>
             </w:r>
           </w:p>
         </w:tc>
@@ -624,6 +719,9 @@
             <w:tcW w:type="dxa" w:w="2880"/>
           </w:tcPr>
           <w:p>
+            <w:pPr>
+              <w:jc w:val="center"/>
+            </w:pPr>
             <w:r/>
             <w:r>
               <w:rPr>
@@ -640,6 +738,9 @@
             <w:tcW w:type="dxa" w:w="2880"/>
           </w:tcPr>
           <w:p>
+            <w:pPr>
+              <w:jc w:val="center"/>
+            </w:pPr>
             <w:r/>
             <w:r>
               <w:rPr>
@@ -656,6 +757,9 @@
             <w:tcW w:type="dxa" w:w="2880"/>
           </w:tcPr>
           <w:p>
+            <w:pPr>
+              <w:jc w:val="center"/>
+            </w:pPr>
             <w:r/>
             <w:r>
               <w:rPr>
@@ -663,7 +767,7 @@
                 <w:b w:val="0"/>
                 <w:sz w:val="21"/>
               </w:rPr>
-              <w:t>32 × 14 × 14</w:t>
+              <w:t>32×14×14</w:t>
             </w:r>
           </w:p>
         </w:tc>
@@ -674,6 +778,9 @@
             <w:tcW w:type="dxa" w:w="2880"/>
           </w:tcPr>
           <w:p>
+            <w:pPr>
+              <w:jc w:val="center"/>
+            </w:pPr>
             <w:r/>
             <w:r>
               <w:rPr>
@@ -690,6 +797,9 @@
             <w:tcW w:type="dxa" w:w="2880"/>
           </w:tcPr>
           <w:p>
+            <w:pPr>
+              <w:jc w:val="center"/>
+            </w:pPr>
             <w:r/>
             <w:r>
               <w:rPr>
@@ -706,6 +816,9 @@
             <w:tcW w:type="dxa" w:w="2880"/>
           </w:tcPr>
           <w:p>
+            <w:pPr>
+              <w:jc w:val="center"/>
+            </w:pPr>
             <w:r/>
             <w:r>
               <w:rPr>
@@ -713,7 +826,7 @@
                 <w:b w:val="0"/>
                 <w:sz w:val="21"/>
               </w:rPr>
-              <w:t>64 × 14 × 14</w:t>
+              <w:t>64×14×14</w:t>
             </w:r>
           </w:p>
         </w:tc>
@@ -724,6 +837,9 @@
             <w:tcW w:type="dxa" w:w="2880"/>
           </w:tcPr>
           <w:p>
+            <w:pPr>
+              <w:jc w:val="center"/>
+            </w:pPr>
             <w:r/>
             <w:r>
               <w:rPr>
@@ -740,6 +856,9 @@
             <w:tcW w:type="dxa" w:w="2880"/>
           </w:tcPr>
           <w:p>
+            <w:pPr>
+              <w:jc w:val="center"/>
+            </w:pPr>
             <w:r/>
             <w:r>
               <w:rPr>
@@ -756,6 +875,9 @@
             <w:tcW w:type="dxa" w:w="2880"/>
           </w:tcPr>
           <w:p>
+            <w:pPr>
+              <w:jc w:val="center"/>
+            </w:pPr>
             <w:r/>
             <w:r>
               <w:rPr>
@@ -763,7 +885,7 @@
                 <w:b w:val="0"/>
                 <w:sz w:val="21"/>
               </w:rPr>
-              <w:t>64 × 7 × 7</w:t>
+              <w:t>64×7×7</w:t>
             </w:r>
           </w:p>
         </w:tc>
@@ -774,6 +896,9 @@
             <w:tcW w:type="dxa" w:w="2880"/>
           </w:tcPr>
           <w:p>
+            <w:pPr>
+              <w:jc w:val="center"/>
+            </w:pPr>
             <w:r/>
             <w:r>
               <w:rPr>
@@ -790,6 +915,9 @@
             <w:tcW w:type="dxa" w:w="2880"/>
           </w:tcPr>
           <w:p>
+            <w:pPr>
+              <w:jc w:val="center"/>
+            </w:pPr>
             <w:r/>
             <w:r>
               <w:rPr>
@@ -806,6 +934,9 @@
             <w:tcW w:type="dxa" w:w="2880"/>
           </w:tcPr>
           <w:p>
+            <w:pPr>
+              <w:jc w:val="center"/>
+            </w:pPr>
             <w:r/>
             <w:r>
               <w:rPr>
@@ -824,6 +955,9 @@
             <w:tcW w:type="dxa" w:w="2880"/>
           </w:tcPr>
           <w:p>
+            <w:pPr>
+              <w:jc w:val="center"/>
+            </w:pPr>
             <w:r/>
             <w:r>
               <w:rPr>
@@ -840,6 +974,9 @@
             <w:tcW w:type="dxa" w:w="2880"/>
           </w:tcPr>
           <w:p>
+            <w:pPr>
+              <w:jc w:val="center"/>
+            </w:pPr>
             <w:r/>
             <w:r>
               <w:rPr>
@@ -856,6 +993,9 @@
             <w:tcW w:type="dxa" w:w="2880"/>
           </w:tcPr>
           <w:p>
+            <w:pPr>
+              <w:jc w:val="center"/>
+            </w:pPr>
             <w:r/>
             <w:r>
               <w:rPr>
@@ -874,6 +1014,9 @@
             <w:tcW w:type="dxa" w:w="2880"/>
           </w:tcPr>
           <w:p>
+            <w:pPr>
+              <w:jc w:val="center"/>
+            </w:pPr>
             <w:r/>
             <w:r>
               <w:rPr>
@@ -890,6 +1033,9 @@
             <w:tcW w:type="dxa" w:w="2880"/>
           </w:tcPr>
           <w:p>
+            <w:pPr>
+              <w:jc w:val="center"/>
+            </w:pPr>
             <w:r/>
             <w:r>
               <w:rPr>
@@ -906,6 +1052,9 @@
             <w:tcW w:type="dxa" w:w="2880"/>
           </w:tcPr>
           <w:p>
+            <w:pPr>
+              <w:jc w:val="center"/>
+            </w:pPr>
             <w:r/>
             <w:r>
               <w:rPr>
@@ -920,109 +1069,73 @@
       </w:tr>
     </w:tbl>
     <w:p>
+      <w:pPr>
+        <w:spacing w:before="0" w:after="0" w:line="360" w:lineRule="auto"/>
+        <w:ind w:firstLine="480"/>
+      </w:pPr>
       <w:r>
         <w:rPr>
           <w:rFonts w:ascii="Times New Roman" w:hAnsi="Times New Roman" w:eastAsia="宋体"/>
           <w:b w:val="0"/>
           <w:sz w:val="24"/>
         </w:rPr>
-        <w:t>模型可训练参数总数：421,642。</w:t>
+        <w:t>网络由两组「卷积+ReLU+最大池化」逐层提取边缘、笔画等局部空间特征并降低分辨率，再经全连接层映射到 10 个类别得分，其中 Dropout(0.5) 用于抑制过拟合。模型可训练参数总数为 421,642。</w:t>
       </w:r>
     </w:p>
     <w:p>
       <w:pPr>
-        <w:pStyle w:val="Heading2"/>
+        <w:spacing w:before="120" w:after="120" w:line="360" w:lineRule="auto"/>
       </w:pPr>
       <w:r>
         <w:rPr>
           <w:rFonts w:ascii="Times New Roman" w:hAnsi="Times New Roman" w:eastAsia="宋体"/>
           <w:b/>
-          <w:sz w:val="28"/>
+          <w:sz w:val="24"/>
         </w:rPr>
-        <w:t>4.3 训练网络</w:t>
+        <w:t>5.3　训练网络</w:t>
       </w:r>
     </w:p>
     <w:p>
+      <w:pPr>
+        <w:spacing w:before="0" w:after="0" w:line="360" w:lineRule="auto"/>
+        <w:ind w:firstLine="480"/>
+      </w:pPr>
       <w:r>
         <w:rPr>
           <w:rFonts w:ascii="Times New Roman" w:hAnsi="Times New Roman" w:eastAsia="宋体"/>
           <w:b w:val="0"/>
           <w:sz w:val="24"/>
         </w:rPr>
-        <w:t>· 损失函数：交叉熵损失 CrossEntropyLoss（内部含 Softmax，适合多分类）；</w:t>
-      </w:r>
-    </w:p>
-    <w:p>
-      <w:r>
-        <w:rPr>
-          <w:rFonts w:ascii="Times New Roman" w:hAnsi="Times New Roman" w:eastAsia="宋体"/>
-          <w:b w:val="0"/>
-          <w:sz w:val="24"/>
-        </w:rPr>
-        <w:t>· 优化器：Adam，学习率 lr=0.001；</w:t>
-      </w:r>
-    </w:p>
-    <w:p>
-      <w:r>
-        <w:rPr>
-          <w:rFonts w:ascii="Times New Roman" w:hAnsi="Times New Roman" w:eastAsia="宋体"/>
-          <w:b w:val="0"/>
-          <w:sz w:val="24"/>
-        </w:rPr>
-        <w:t>· 迭代次数 Epochs=10；每轮做前向→计算损失→反向传播→参数更新；</w:t>
-      </w:r>
-    </w:p>
-    <w:p>
-      <w:r>
-        <w:rPr>
-          <w:rFonts w:ascii="Times New Roman" w:hAnsi="Times New Roman" w:eastAsia="宋体"/>
-          <w:b w:val="0"/>
-          <w:sz w:val="24"/>
-        </w:rPr>
-        <w:t>· 随机种子固定为 42，保证结果可复现。</w:t>
+        <w:t>损失函数采用交叉熵损失 CrossEntropyLoss（内部含 Softmax，适合多分类）；优化器采用 Adam，学习率 lr=0.001；迭代次数 Epochs=10；随机种子固定为 42 以保证可复现。每个 epoch 遍历一次全部训练数据，按 batch 执行前向传播→计算损失→反向传播→参数更新。具体神经网络参数设置见表 2。</w:t>
       </w:r>
     </w:p>
     <w:p>
       <w:pPr>
-        <w:pStyle w:val="Heading2"/>
+        <w:spacing w:before="120" w:after="40"/>
+        <w:jc w:val="center"/>
       </w:pPr>
       <w:r>
         <w:rPr>
           <w:rFonts w:ascii="Times New Roman" w:hAnsi="Times New Roman" w:eastAsia="宋体"/>
           <w:b/>
-          <w:sz w:val="28"/>
+          <w:sz w:val="21"/>
         </w:rPr>
-        <w:t>4.4 测试网络</w:t>
-      </w:r>
-    </w:p>
-    <w:p>
-      <w:r>
-        <w:rPr>
-          <w:rFonts w:ascii="Times New Roman" w:hAnsi="Times New Roman" w:eastAsia="宋体"/>
-          <w:b w:val="0"/>
-          <w:sz w:val="24"/>
-        </w:rPr>
-        <w:t>每个 epoch 结束后，在 1 万张测试集上用 model.eval()+torch.no_grad() 评估损失与准确率（准确率 = 预测正确样本数 / 总样本数），并记录最优精度。</w:t>
-      </w:r>
-    </w:p>
-    <w:p>
-      <w:pPr>
-        <w:pStyle w:val="Heading1"/>
-      </w:pPr>
-      <w:r>
-        <w:rPr>
-          <w:rFonts w:ascii="Times New Roman" w:hAnsi="Times New Roman" w:eastAsia="宋体"/>
-          <w:b/>
-          <w:sz w:val="32"/>
-        </w:rPr>
-        <w:t>五、神经网络参数设置（汇总）</w:t>
+        <w:t>表 2　神经网络参数设置</w:t>
       </w:r>
     </w:p>
     <w:tbl>
       <w:tblPr>
-        <w:tblStyle w:val="LightGrid-Accent1"/>
         <w:tblW w:type="auto" w:w="0"/>
+        <w:jc w:val="center"/>
         <w:tblLook w:firstColumn="1" w:firstRow="1" w:lastColumn="0" w:lastRow="0" w:noHBand="0" w:noVBand="1" w:val="04A0"/>
+        <w:tblBorders>
+          <w:top w:val="single" w:sz="12" w:space="0" w:color="000000"/>
+          <w:bottom w:val="single" w:sz="12" w:space="0" w:color="000000"/>
+          <w:left w:val="none" w:sz="0" w:space="0" w:color="000000"/>
+          <w:right w:val="none" w:sz="0" w:space="0" w:color="000000"/>
+          <w:insideV w:val="none" w:sz="0" w:space="0" w:color="000000"/>
+          <w:insideH w:val="none" w:sz="0" w:space="0" w:color="000000"/>
+        </w:tblBorders>
       </w:tblPr>
       <w:tblGrid>
         <w:gridCol w:w="4320"/>
@@ -1032,8 +1145,14 @@
         <w:tc>
           <w:tcPr>
             <w:tcW w:type="dxa" w:w="4320"/>
+            <w:tcBorders>
+              <w:bottom w:val="single" w:sz="6" w:space="0" w:color="000000"/>
+            </w:tcBorders>
           </w:tcPr>
           <w:p>
+            <w:pPr>
+              <w:jc w:val="center"/>
+            </w:pPr>
             <w:r/>
             <w:r>
               <w:rPr>
@@ -1048,8 +1167,14 @@
         <w:tc>
           <w:tcPr>
             <w:tcW w:type="dxa" w:w="4320"/>
+            <w:tcBorders>
+              <w:bottom w:val="single" w:sz="6" w:space="0" w:color="000000"/>
+            </w:tcBorders>
           </w:tcPr>
           <w:p>
+            <w:pPr>
+              <w:jc w:val="center"/>
+            </w:pPr>
             <w:r/>
             <w:r>
               <w:rPr>
@@ -1068,6 +1193,9 @@
             <w:tcW w:type="dxa" w:w="4320"/>
           </w:tcPr>
           <w:p>
+            <w:pPr>
+              <w:jc w:val="center"/>
+            </w:pPr>
             <w:r/>
             <w:r>
               <w:rPr>
@@ -1084,6 +1212,9 @@
             <w:tcW w:type="dxa" w:w="4320"/>
           </w:tcPr>
           <w:p>
+            <w:pPr>
+              <w:jc w:val="center"/>
+            </w:pPr>
             <w:r/>
             <w:r>
               <w:rPr>
@@ -1102,6 +1233,9 @@
             <w:tcW w:type="dxa" w:w="4320"/>
           </w:tcPr>
           <w:p>
+            <w:pPr>
+              <w:jc w:val="center"/>
+            </w:pPr>
             <w:r/>
             <w:r>
               <w:rPr>
@@ -1118,6 +1252,9 @@
             <w:tcW w:type="dxa" w:w="4320"/>
           </w:tcPr>
           <w:p>
+            <w:pPr>
+              <w:jc w:val="center"/>
+            </w:pPr>
             <w:r/>
             <w:r>
               <w:rPr>
@@ -1136,6 +1273,9 @@
             <w:tcW w:type="dxa" w:w="4320"/>
           </w:tcPr>
           <w:p>
+            <w:pPr>
+              <w:jc w:val="center"/>
+            </w:pPr>
             <w:r/>
             <w:r>
               <w:rPr>
@@ -1152,6 +1292,9 @@
             <w:tcW w:type="dxa" w:w="4320"/>
           </w:tcPr>
           <w:p>
+            <w:pPr>
+              <w:jc w:val="center"/>
+            </w:pPr>
             <w:r/>
             <w:r>
               <w:rPr>
@@ -1170,6 +1313,9 @@
             <w:tcW w:type="dxa" w:w="4320"/>
           </w:tcPr>
           <w:p>
+            <w:pPr>
+              <w:jc w:val="center"/>
+            </w:pPr>
             <w:r/>
             <w:r>
               <w:rPr>
@@ -1186,6 +1332,9 @@
             <w:tcW w:type="dxa" w:w="4320"/>
           </w:tcPr>
           <w:p>
+            <w:pPr>
+              <w:jc w:val="center"/>
+            </w:pPr>
             <w:r/>
             <w:r>
               <w:rPr>
@@ -1204,6 +1353,9 @@
             <w:tcW w:type="dxa" w:w="4320"/>
           </w:tcPr>
           <w:p>
+            <w:pPr>
+              <w:jc w:val="center"/>
+            </w:pPr>
             <w:r/>
             <w:r>
               <w:rPr>
@@ -1220,6 +1372,9 @@
             <w:tcW w:type="dxa" w:w="4320"/>
           </w:tcPr>
           <w:p>
+            <w:pPr>
+              <w:jc w:val="center"/>
+            </w:pPr>
             <w:r/>
             <w:r>
               <w:rPr>
@@ -1238,6 +1393,9 @@
             <w:tcW w:type="dxa" w:w="4320"/>
           </w:tcPr>
           <w:p>
+            <w:pPr>
+              <w:jc w:val="center"/>
+            </w:pPr>
             <w:r/>
             <w:r>
               <w:rPr>
@@ -1254,6 +1412,9 @@
             <w:tcW w:type="dxa" w:w="4320"/>
           </w:tcPr>
           <w:p>
+            <w:pPr>
+              <w:jc w:val="center"/>
+            </w:pPr>
             <w:r/>
             <w:r>
               <w:rPr>
@@ -1272,6 +1433,9 @@
             <w:tcW w:type="dxa" w:w="4320"/>
           </w:tcPr>
           <w:p>
+            <w:pPr>
+              <w:jc w:val="center"/>
+            </w:pPr>
             <w:r/>
             <w:r>
               <w:rPr>
@@ -1288,6 +1452,9 @@
             <w:tcW w:type="dxa" w:w="4320"/>
           </w:tcPr>
           <w:p>
+            <w:pPr>
+              <w:jc w:val="center"/>
+            </w:pPr>
             <w:r/>
             <w:r>
               <w:rPr>
@@ -1306,6 +1473,9 @@
             <w:tcW w:type="dxa" w:w="4320"/>
           </w:tcPr>
           <w:p>
+            <w:pPr>
+              <w:jc w:val="center"/>
+            </w:pPr>
             <w:r/>
             <w:r>
               <w:rPr>
@@ -1322,6 +1492,9 @@
             <w:tcW w:type="dxa" w:w="4320"/>
           </w:tcPr>
           <w:p>
+            <w:pPr>
+              <w:jc w:val="center"/>
+            </w:pPr>
             <w:r/>
             <w:r>
               <w:rPr>
@@ -1340,6 +1513,9 @@
             <w:tcW w:type="dxa" w:w="4320"/>
           </w:tcPr>
           <w:p>
+            <w:pPr>
+              <w:jc w:val="center"/>
+            </w:pPr>
             <w:r/>
             <w:r>
               <w:rPr>
@@ -1356,6 +1532,9 @@
             <w:tcW w:type="dxa" w:w="4320"/>
           </w:tcPr>
           <w:p>
+            <w:pPr>
+              <w:jc w:val="center"/>
+            </w:pPr>
             <w:r/>
             <w:r>
               <w:rPr>
@@ -1371,28 +1550,56 @@
     </w:tbl>
     <w:p>
       <w:pPr>
-        <w:pStyle w:val="Heading1"/>
+        <w:spacing w:before="120" w:after="120" w:line="360" w:lineRule="auto"/>
       </w:pPr>
       <w:r>
         <w:rPr>
           <w:rFonts w:ascii="Times New Roman" w:hAnsi="Times New Roman" w:eastAsia="宋体"/>
           <w:b/>
-          <w:sz w:val="32"/>
+          <w:sz w:val="24"/>
         </w:rPr>
-        <w:t>六、实验结果与分析</w:t>
+        <w:t>5.4　测试网络</w:t>
       </w:r>
     </w:p>
     <w:p>
       <w:pPr>
-        <w:pStyle w:val="Heading2"/>
+        <w:spacing w:before="0" w:after="0" w:line="360" w:lineRule="auto"/>
+        <w:ind w:firstLine="480"/>
+      </w:pPr>
+      <w:r>
+        <w:rPr>
+          <w:rFonts w:ascii="Times New Roman" w:hAnsi="Times New Roman" w:eastAsia="宋体"/>
+          <w:b w:val="0"/>
+          <w:sz w:val="24"/>
+        </w:rPr>
+        <w:t>每个 epoch 结束后，在 1 万张测试集上使用 model.eval() 与 torch.no_grad() 模式评估损失与准确率（准确率 = 预测正确样本数 / 总样本数），并记录最优精度。</w:t>
+      </w:r>
+    </w:p>
+    <w:p>
+      <w:pPr>
+        <w:spacing w:before="120" w:after="120" w:line="360" w:lineRule="auto"/>
       </w:pPr>
       <w:r>
         <w:rPr>
           <w:rFonts w:ascii="Times New Roman" w:hAnsi="Times New Roman" w:eastAsia="宋体"/>
           <w:b/>
-          <w:sz w:val="28"/>
+          <w:sz w:val="24"/>
         </w:rPr>
-        <w:t>6.1 训练/测试日志与最终精度（精度截图）</w:t>
+        <w:t>5.5　结果输出与分析</w:t>
+      </w:r>
+    </w:p>
+    <w:p>
+      <w:pPr>
+        <w:spacing w:before="0" w:after="0" w:line="360" w:lineRule="auto"/>
+        <w:ind w:firstLine="480"/>
+      </w:pPr>
+      <w:r>
+        <w:rPr>
+          <w:rFonts w:ascii="Times New Roman" w:hAnsi="Times New Roman" w:eastAsia="宋体"/>
+          <w:b w:val="0"/>
+          <w:sz w:val="24"/>
+        </w:rPr>
+        <w:t>完整训练日志与最终测试精度如图 2 所示，逐轮训练/测试结果如表 3 所示。</w:t>
       </w:r>
     </w:p>
     <w:p>
@@ -1402,7 +1609,7 @@
       <w:r>
         <w:drawing>
           <wp:inline xmlns:a="http://schemas.openxmlformats.org/drawingml/2006/main" xmlns:pic="http://schemas.openxmlformats.org/drawingml/2006/picture">
-            <wp:extent cx="5943600" cy="3289568"/>
+            <wp:extent cx="5852160" cy="3238959"/>
             <wp:docPr id="2" name="Picture 2"/>
             <wp:cNvGraphicFramePr>
               <a:graphicFrameLocks noChangeAspect="1"/>
@@ -1423,7 +1630,7 @@
                   <pic:spPr>
                     <a:xfrm>
                       <a:off x="0" y="0"/>
-                      <a:ext cx="5943600" cy="3289568"/>
+                      <a:ext cx="5852160" cy="3238959"/>
                     </a:xfrm>
                     <a:prstGeom prst="rect"/>
                   </pic:spPr>
@@ -1436,23 +1643,45 @@
     </w:p>
     <w:p>
       <w:pPr>
+        <w:spacing w:before="40" w:after="120"/>
         <w:jc w:val="center"/>
       </w:pPr>
       <w:r>
         <w:rPr>
           <w:rFonts w:ascii="Times New Roman" w:hAnsi="Times New Roman" w:eastAsia="宋体"/>
-          <w:b w:val="0"/>
-          <w:i/>
+          <w:b/>
           <w:sz w:val="21"/>
         </w:rPr>
-        <w:t>图2 训练日志与最终测试精度</w:t>
+        <w:t>图 2　训练日志与最终测试精度</w:t>
+      </w:r>
+    </w:p>
+    <w:p>
+      <w:pPr>
+        <w:spacing w:before="120" w:after="40"/>
+        <w:jc w:val="center"/>
+      </w:pPr>
+      <w:r>
+        <w:rPr>
+          <w:rFonts w:ascii="Times New Roman" w:hAnsi="Times New Roman" w:eastAsia="宋体"/>
+          <w:b/>
+          <w:sz w:val="21"/>
+        </w:rPr>
+        <w:t>表 3　逐轮训练与测试结果</w:t>
       </w:r>
     </w:p>
     <w:tbl>
       <w:tblPr>
-        <w:tblStyle w:val="LightGrid-Accent1"/>
         <w:tblW w:type="auto" w:w="0"/>
+        <w:jc w:val="center"/>
         <w:tblLook w:firstColumn="1" w:firstRow="1" w:lastColumn="0" w:lastRow="0" w:noHBand="0" w:noVBand="1" w:val="04A0"/>
+        <w:tblBorders>
+          <w:top w:val="single" w:sz="12" w:space="0" w:color="000000"/>
+          <w:bottom w:val="single" w:sz="12" w:space="0" w:color="000000"/>
+          <w:left w:val="none" w:sz="0" w:space="0" w:color="000000"/>
+          <w:right w:val="none" w:sz="0" w:space="0" w:color="000000"/>
+          <w:insideV w:val="none" w:sz="0" w:space="0" w:color="000000"/>
+          <w:insideH w:val="none" w:sz="0" w:space="0" w:color="000000"/>
+        </w:tblBorders>
       </w:tblPr>
       <w:tblGrid>
         <w:gridCol w:w="1728"/>
@@ -1465,8 +1694,14 @@
         <w:tc>
           <w:tcPr>
             <w:tcW w:type="dxa" w:w="1728"/>
+            <w:tcBorders>
+              <w:bottom w:val="single" w:sz="6" w:space="0" w:color="000000"/>
+            </w:tcBorders>
           </w:tcPr>
           <w:p>
+            <w:pPr>
+              <w:jc w:val="center"/>
+            </w:pPr>
             <w:r/>
             <w:r>
               <w:rPr>
@@ -1481,8 +1716,14 @@
         <w:tc>
           <w:tcPr>
             <w:tcW w:type="dxa" w:w="1728"/>
+            <w:tcBorders>
+              <w:bottom w:val="single" w:sz="6" w:space="0" w:color="000000"/>
+            </w:tcBorders>
           </w:tcPr>
           <w:p>
+            <w:pPr>
+              <w:jc w:val="center"/>
+            </w:pPr>
             <w:r/>
             <w:r>
               <w:rPr>
@@ -1497,8 +1738,14 @@
         <w:tc>
           <w:tcPr>
             <w:tcW w:type="dxa" w:w="1728"/>
+            <w:tcBorders>
+              <w:bottom w:val="single" w:sz="6" w:space="0" w:color="000000"/>
+            </w:tcBorders>
           </w:tcPr>
           <w:p>
+            <w:pPr>
+              <w:jc w:val="center"/>
+            </w:pPr>
             <w:r/>
             <w:r>
               <w:rPr>
@@ -1513,8 +1760,14 @@
         <w:tc>
           <w:tcPr>
             <w:tcW w:type="dxa" w:w="1728"/>
+            <w:tcBorders>
+              <w:bottom w:val="single" w:sz="6" w:space="0" w:color="000000"/>
+            </w:tcBorders>
           </w:tcPr>
           <w:p>
+            <w:pPr>
+              <w:jc w:val="center"/>
+            </w:pPr>
             <w:r/>
             <w:r>
               <w:rPr>
@@ -1529,8 +1782,14 @@
         <w:tc>
           <w:tcPr>
             <w:tcW w:type="dxa" w:w="1728"/>
+            <w:tcBorders>
+              <w:bottom w:val="single" w:sz="6" w:space="0" w:color="000000"/>
+            </w:tcBorders>
           </w:tcPr>
           <w:p>
+            <w:pPr>
+              <w:jc w:val="center"/>
+            </w:pPr>
             <w:r/>
             <w:r>
               <w:rPr>
@@ -1549,6 +1808,9 @@
             <w:tcW w:type="dxa" w:w="1728"/>
           </w:tcPr>
           <w:p>
+            <w:pPr>
+              <w:jc w:val="center"/>
+            </w:pPr>
             <w:r/>
             <w:r>
               <w:rPr>
@@ -1565,6 +1827,9 @@
             <w:tcW w:type="dxa" w:w="1728"/>
           </w:tcPr>
           <w:p>
+            <w:pPr>
+              <w:jc w:val="center"/>
+            </w:pPr>
             <w:r/>
             <w:r>
               <w:rPr>
@@ -1581,6 +1846,9 @@
             <w:tcW w:type="dxa" w:w="1728"/>
           </w:tcPr>
           <w:p>
+            <w:pPr>
+              <w:jc w:val="center"/>
+            </w:pPr>
             <w:r/>
             <w:r>
               <w:rPr>
@@ -1597,6 +1865,9 @@
             <w:tcW w:type="dxa" w:w="1728"/>
           </w:tcPr>
           <w:p>
+            <w:pPr>
+              <w:jc w:val="center"/>
+            </w:pPr>
             <w:r/>
             <w:r>
               <w:rPr>
@@ -1613,6 +1884,9 @@
             <w:tcW w:type="dxa" w:w="1728"/>
           </w:tcPr>
           <w:p>
+            <w:pPr>
+              <w:jc w:val="center"/>
+            </w:pPr>
             <w:r/>
             <w:r>
               <w:rPr>
@@ -1631,6 +1905,9 @@
             <w:tcW w:type="dxa" w:w="1728"/>
           </w:tcPr>
           <w:p>
+            <w:pPr>
+              <w:jc w:val="center"/>
+            </w:pPr>
             <w:r/>
             <w:r>
               <w:rPr>
@@ -1647,6 +1924,9 @@
             <w:tcW w:type="dxa" w:w="1728"/>
           </w:tcPr>
           <w:p>
+            <w:pPr>
+              <w:jc w:val="center"/>
+            </w:pPr>
             <w:r/>
             <w:r>
               <w:rPr>
@@ -1663,6 +1943,9 @@
             <w:tcW w:type="dxa" w:w="1728"/>
           </w:tcPr>
           <w:p>
+            <w:pPr>
+              <w:jc w:val="center"/>
+            </w:pPr>
             <w:r/>
             <w:r>
               <w:rPr>
@@ -1679,6 +1962,9 @@
             <w:tcW w:type="dxa" w:w="1728"/>
           </w:tcPr>
           <w:p>
+            <w:pPr>
+              <w:jc w:val="center"/>
+            </w:pPr>
             <w:r/>
             <w:r>
               <w:rPr>
@@ -1695,6 +1981,9 @@
             <w:tcW w:type="dxa" w:w="1728"/>
           </w:tcPr>
           <w:p>
+            <w:pPr>
+              <w:jc w:val="center"/>
+            </w:pPr>
             <w:r/>
             <w:r>
               <w:rPr>
@@ -1713,6 +2002,9 @@
             <w:tcW w:type="dxa" w:w="1728"/>
           </w:tcPr>
           <w:p>
+            <w:pPr>
+              <w:jc w:val="center"/>
+            </w:pPr>
             <w:r/>
             <w:r>
               <w:rPr>
@@ -1729,6 +2021,9 @@
             <w:tcW w:type="dxa" w:w="1728"/>
           </w:tcPr>
           <w:p>
+            <w:pPr>
+              <w:jc w:val="center"/>
+            </w:pPr>
             <w:r/>
             <w:r>
               <w:rPr>
@@ -1745,6 +2040,9 @@
             <w:tcW w:type="dxa" w:w="1728"/>
           </w:tcPr>
           <w:p>
+            <w:pPr>
+              <w:jc w:val="center"/>
+            </w:pPr>
             <w:r/>
             <w:r>
               <w:rPr>
@@ -1761,6 +2059,9 @@
             <w:tcW w:type="dxa" w:w="1728"/>
           </w:tcPr>
           <w:p>
+            <w:pPr>
+              <w:jc w:val="center"/>
+            </w:pPr>
             <w:r/>
             <w:r>
               <w:rPr>
@@ -1777,6 +2078,9 @@
             <w:tcW w:type="dxa" w:w="1728"/>
           </w:tcPr>
           <w:p>
+            <w:pPr>
+              <w:jc w:val="center"/>
+            </w:pPr>
             <w:r/>
             <w:r>
               <w:rPr>
@@ -1795,6 +2099,9 @@
             <w:tcW w:type="dxa" w:w="1728"/>
           </w:tcPr>
           <w:p>
+            <w:pPr>
+              <w:jc w:val="center"/>
+            </w:pPr>
             <w:r/>
             <w:r>
               <w:rPr>
@@ -1811,6 +2118,9 @@
             <w:tcW w:type="dxa" w:w="1728"/>
           </w:tcPr>
           <w:p>
+            <w:pPr>
+              <w:jc w:val="center"/>
+            </w:pPr>
             <w:r/>
             <w:r>
               <w:rPr>
@@ -1827,6 +2137,9 @@
             <w:tcW w:type="dxa" w:w="1728"/>
           </w:tcPr>
           <w:p>
+            <w:pPr>
+              <w:jc w:val="center"/>
+            </w:pPr>
             <w:r/>
             <w:r>
               <w:rPr>
@@ -1843,6 +2156,9 @@
             <w:tcW w:type="dxa" w:w="1728"/>
           </w:tcPr>
           <w:p>
+            <w:pPr>
+              <w:jc w:val="center"/>
+            </w:pPr>
             <w:r/>
             <w:r>
               <w:rPr>
@@ -1859,6 +2175,9 @@
             <w:tcW w:type="dxa" w:w="1728"/>
           </w:tcPr>
           <w:p>
+            <w:pPr>
+              <w:jc w:val="center"/>
+            </w:pPr>
             <w:r/>
             <w:r>
               <w:rPr>
@@ -1877,6 +2196,9 @@
             <w:tcW w:type="dxa" w:w="1728"/>
           </w:tcPr>
           <w:p>
+            <w:pPr>
+              <w:jc w:val="center"/>
+            </w:pPr>
             <w:r/>
             <w:r>
               <w:rPr>
@@ -1893,6 +2215,9 @@
             <w:tcW w:type="dxa" w:w="1728"/>
           </w:tcPr>
           <w:p>
+            <w:pPr>
+              <w:jc w:val="center"/>
+            </w:pPr>
             <w:r/>
             <w:r>
               <w:rPr>
@@ -1909,6 +2234,9 @@
             <w:tcW w:type="dxa" w:w="1728"/>
           </w:tcPr>
           <w:p>
+            <w:pPr>
+              <w:jc w:val="center"/>
+            </w:pPr>
             <w:r/>
             <w:r>
               <w:rPr>
@@ -1925,6 +2253,9 @@
             <w:tcW w:type="dxa" w:w="1728"/>
           </w:tcPr>
           <w:p>
+            <w:pPr>
+              <w:jc w:val="center"/>
+            </w:pPr>
             <w:r/>
             <w:r>
               <w:rPr>
@@ -1941,6 +2272,9 @@
             <w:tcW w:type="dxa" w:w="1728"/>
           </w:tcPr>
           <w:p>
+            <w:pPr>
+              <w:jc w:val="center"/>
+            </w:pPr>
             <w:r/>
             <w:r>
               <w:rPr>
@@ -1959,6 +2293,9 @@
             <w:tcW w:type="dxa" w:w="1728"/>
           </w:tcPr>
           <w:p>
+            <w:pPr>
+              <w:jc w:val="center"/>
+            </w:pPr>
             <w:r/>
             <w:r>
               <w:rPr>
@@ -1975,6 +2312,9 @@
             <w:tcW w:type="dxa" w:w="1728"/>
           </w:tcPr>
           <w:p>
+            <w:pPr>
+              <w:jc w:val="center"/>
+            </w:pPr>
             <w:r/>
             <w:r>
               <w:rPr>
@@ -1991,6 +2331,9 @@
             <w:tcW w:type="dxa" w:w="1728"/>
           </w:tcPr>
           <w:p>
+            <w:pPr>
+              <w:jc w:val="center"/>
+            </w:pPr>
             <w:r/>
             <w:r>
               <w:rPr>
@@ -2007,6 +2350,9 @@
             <w:tcW w:type="dxa" w:w="1728"/>
           </w:tcPr>
           <w:p>
+            <w:pPr>
+              <w:jc w:val="center"/>
+            </w:pPr>
             <w:r/>
             <w:r>
               <w:rPr>
@@ -2023,6 +2369,9 @@
             <w:tcW w:type="dxa" w:w="1728"/>
           </w:tcPr>
           <w:p>
+            <w:pPr>
+              <w:jc w:val="center"/>
+            </w:pPr>
             <w:r/>
             <w:r>
               <w:rPr>
@@ -2041,6 +2390,9 @@
             <w:tcW w:type="dxa" w:w="1728"/>
           </w:tcPr>
           <w:p>
+            <w:pPr>
+              <w:jc w:val="center"/>
+            </w:pPr>
             <w:r/>
             <w:r>
               <w:rPr>
@@ -2057,6 +2409,9 @@
             <w:tcW w:type="dxa" w:w="1728"/>
           </w:tcPr>
           <w:p>
+            <w:pPr>
+              <w:jc w:val="center"/>
+            </w:pPr>
             <w:r/>
             <w:r>
               <w:rPr>
@@ -2073,6 +2428,9 @@
             <w:tcW w:type="dxa" w:w="1728"/>
           </w:tcPr>
           <w:p>
+            <w:pPr>
+              <w:jc w:val="center"/>
+            </w:pPr>
             <w:r/>
             <w:r>
               <w:rPr>
@@ -2089,6 +2447,9 @@
             <w:tcW w:type="dxa" w:w="1728"/>
           </w:tcPr>
           <w:p>
+            <w:pPr>
+              <w:jc w:val="center"/>
+            </w:pPr>
             <w:r/>
             <w:r>
               <w:rPr>
@@ -2105,6 +2466,9 @@
             <w:tcW w:type="dxa" w:w="1728"/>
           </w:tcPr>
           <w:p>
+            <w:pPr>
+              <w:jc w:val="center"/>
+            </w:pPr>
             <w:r/>
             <w:r>
               <w:rPr>
@@ -2123,6 +2487,9 @@
             <w:tcW w:type="dxa" w:w="1728"/>
           </w:tcPr>
           <w:p>
+            <w:pPr>
+              <w:jc w:val="center"/>
+            </w:pPr>
             <w:r/>
             <w:r>
               <w:rPr>
@@ -2139,6 +2506,9 @@
             <w:tcW w:type="dxa" w:w="1728"/>
           </w:tcPr>
           <w:p>
+            <w:pPr>
+              <w:jc w:val="center"/>
+            </w:pPr>
             <w:r/>
             <w:r>
               <w:rPr>
@@ -2155,6 +2525,9 @@
             <w:tcW w:type="dxa" w:w="1728"/>
           </w:tcPr>
           <w:p>
+            <w:pPr>
+              <w:jc w:val="center"/>
+            </w:pPr>
             <w:r/>
             <w:r>
               <w:rPr>
@@ -2171,6 +2544,9 @@
             <w:tcW w:type="dxa" w:w="1728"/>
           </w:tcPr>
           <w:p>
+            <w:pPr>
+              <w:jc w:val="center"/>
+            </w:pPr>
             <w:r/>
             <w:r>
               <w:rPr>
@@ -2187,6 +2563,9 @@
             <w:tcW w:type="dxa" w:w="1728"/>
           </w:tcPr>
           <w:p>
+            <w:pPr>
+              <w:jc w:val="center"/>
+            </w:pPr>
             <w:r/>
             <w:r>
               <w:rPr>
@@ -2205,6 +2584,9 @@
             <w:tcW w:type="dxa" w:w="1728"/>
           </w:tcPr>
           <w:p>
+            <w:pPr>
+              <w:jc w:val="center"/>
+            </w:pPr>
             <w:r/>
             <w:r>
               <w:rPr>
@@ -2221,6 +2603,9 @@
             <w:tcW w:type="dxa" w:w="1728"/>
           </w:tcPr>
           <w:p>
+            <w:pPr>
+              <w:jc w:val="center"/>
+            </w:pPr>
             <w:r/>
             <w:r>
               <w:rPr>
@@ -2237,6 +2622,9 @@
             <w:tcW w:type="dxa" w:w="1728"/>
           </w:tcPr>
           <w:p>
+            <w:pPr>
+              <w:jc w:val="center"/>
+            </w:pPr>
             <w:r/>
             <w:r>
               <w:rPr>
@@ -2253,6 +2641,9 @@
             <w:tcW w:type="dxa" w:w="1728"/>
           </w:tcPr>
           <w:p>
+            <w:pPr>
+              <w:jc w:val="center"/>
+            </w:pPr>
             <w:r/>
             <w:r>
               <w:rPr>
@@ -2269,6 +2660,9 @@
             <w:tcW w:type="dxa" w:w="1728"/>
           </w:tcPr>
           <w:p>
+            <w:pPr>
+              <w:jc w:val="center"/>
+            </w:pPr>
             <w:r/>
             <w:r>
               <w:rPr>
@@ -2287,6 +2681,9 @@
             <w:tcW w:type="dxa" w:w="1728"/>
           </w:tcPr>
           <w:p>
+            <w:pPr>
+              <w:jc w:val="center"/>
+            </w:pPr>
             <w:r/>
             <w:r>
               <w:rPr>
@@ -2303,6 +2700,9 @@
             <w:tcW w:type="dxa" w:w="1728"/>
           </w:tcPr>
           <w:p>
+            <w:pPr>
+              <w:jc w:val="center"/>
+            </w:pPr>
             <w:r/>
             <w:r>
               <w:rPr>
@@ -2319,6 +2719,9 @@
             <w:tcW w:type="dxa" w:w="1728"/>
           </w:tcPr>
           <w:p>
+            <w:pPr>
+              <w:jc w:val="center"/>
+            </w:pPr>
             <w:r/>
             <w:r>
               <w:rPr>
@@ -2335,6 +2738,9 @@
             <w:tcW w:type="dxa" w:w="1728"/>
           </w:tcPr>
           <w:p>
+            <w:pPr>
+              <w:jc w:val="center"/>
+            </w:pPr>
             <w:r/>
             <w:r>
               <w:rPr>
@@ -2351,6 +2757,9 @@
             <w:tcW w:type="dxa" w:w="1728"/>
           </w:tcPr>
           <w:p>
+            <w:pPr>
+              <w:jc w:val="center"/>
+            </w:pPr>
             <w:r/>
             <w:r>
               <w:rPr>
@@ -2365,26 +2774,31 @@
       </w:tr>
     </w:tbl>
     <w:p>
+      <w:pPr>
+        <w:spacing w:before="0" w:after="0" w:line="360" w:lineRule="auto"/>
+        <w:ind w:firstLine="480"/>
+      </w:pPr>
       <w:r>
         <w:rPr>
           <w:rFonts w:ascii="Times New Roman" w:hAnsi="Times New Roman" w:eastAsia="宋体"/>
           <w:b/>
           <w:sz w:val="24"/>
         </w:rPr>
-        <w:t>最终测试精度：99.35%（最佳 99.36%）。</w:t>
+        <w:t>最终测试精度为 99.35%（最佳 99.36%），CPU 训练总耗时约 118.5 秒。</w:t>
       </w:r>
     </w:p>
     <w:p>
       <w:pPr>
-        <w:pStyle w:val="Heading2"/>
+        <w:spacing w:before="0" w:after="0" w:line="360" w:lineRule="auto"/>
+        <w:ind w:firstLine="480"/>
       </w:pPr>
       <w:r>
         <w:rPr>
           <w:rFonts w:ascii="Times New Roman" w:hAnsi="Times New Roman" w:eastAsia="宋体"/>
-          <w:b/>
-          <w:sz w:val="28"/>
+          <w:b w:val="0"/>
+          <w:sz w:val="24"/>
         </w:rPr>
-        <w:t>6.2 损失与精度曲线</w:t>
+        <w:t>训练/测试的损失与精度曲线如图 3 所示。</w:t>
       </w:r>
     </w:p>
     <w:p>
@@ -2394,7 +2808,7 @@
       <w:r>
         <w:drawing>
           <wp:inline xmlns:a="http://schemas.openxmlformats.org/drawingml/2006/main" xmlns:pic="http://schemas.openxmlformats.org/drawingml/2006/picture">
-            <wp:extent cx="5943600" cy="2161309"/>
+            <wp:extent cx="5852160" cy="2128058"/>
             <wp:docPr id="3" name="Picture 3"/>
             <wp:cNvGraphicFramePr>
               <a:graphicFrameLocks noChangeAspect="1"/>
@@ -2415,7 +2829,7 @@
                   <pic:spPr>
                     <a:xfrm>
                       <a:off x="0" y="0"/>
-                      <a:ext cx="5943600" cy="2161309"/>
+                      <a:ext cx="5852160" cy="2128058"/>
                     </a:xfrm>
                     <a:prstGeom prst="rect"/>
                   </pic:spPr>
@@ -2428,59 +2842,44 @@
     </w:p>
     <w:p>
       <w:pPr>
+        <w:spacing w:before="40" w:after="120"/>
         <w:jc w:val="center"/>
       </w:pPr>
       <w:r>
         <w:rPr>
           <w:rFonts w:ascii="Times New Roman" w:hAnsi="Times New Roman" w:eastAsia="宋体"/>
-          <w:b w:val="0"/>
-          <w:i/>
+          <w:b/>
           <w:sz w:val="21"/>
         </w:rPr>
-        <w:t>图3 训练/测试 损失与精度曲线</w:t>
+        <w:t>图 3　训练/测试损失与精度曲线</w:t>
       </w:r>
     </w:p>
     <w:p>
+      <w:pPr>
+        <w:spacing w:before="0" w:after="0" w:line="360" w:lineRule="auto"/>
+        <w:ind w:firstLine="480"/>
+      </w:pPr>
       <w:r>
         <w:rPr>
           <w:rFonts w:ascii="Times New Roman" w:hAnsi="Times New Roman" w:eastAsia="宋体"/>
           <w:b w:val="0"/>
           <w:sz w:val="24"/>
         </w:rPr>
-        <w:t>· 训练损失从约 0.21 快速下降并趋于平稳，测试损失同步下降，模型有效学习且无明显过拟合；</w:t>
+        <w:t>由图可见：训练损失从约 0.21 快速下降并趋于平稳，测试损失同步下降，说明模型有效学习且无明显过拟合；测试精度在第 1 个 epoch 即达到 98.25%，第 3 个 epoch 后稳定在 99% 以上；训练精度与测试精度差距很小（约 0.1%），表明 Dropout 与较浅的网络结构有效控制了过拟合。</w:t>
       </w:r>
     </w:p>
     <w:p>
+      <w:pPr>
+        <w:spacing w:before="0" w:after="0" w:line="360" w:lineRule="auto"/>
+        <w:ind w:firstLine="480"/>
+      </w:pPr>
       <w:r>
         <w:rPr>
           <w:rFonts w:ascii="Times New Roman" w:hAnsi="Times New Roman" w:eastAsia="宋体"/>
           <w:b w:val="0"/>
           <w:sz w:val="24"/>
         </w:rPr>
-        <w:t>· 测试精度第 1 个 epoch 即达 98.25%，第 3 个 epoch 后稳定在 99% 以上；</w:t>
-      </w:r>
-    </w:p>
-    <w:p>
-      <w:r>
-        <w:rPr>
-          <w:rFonts w:ascii="Times New Roman" w:hAnsi="Times New Roman" w:eastAsia="宋体"/>
-          <w:b w:val="0"/>
-          <w:sz w:val="24"/>
-        </w:rPr>
-        <w:t>· 训练精度与测试精度差距很小，表明 Dropout 与较浅网络有效控制了过拟合。</w:t>
-      </w:r>
-    </w:p>
-    <w:p>
-      <w:pPr>
-        <w:pStyle w:val="Heading2"/>
-      </w:pPr>
-      <w:r>
-        <w:rPr>
-          <w:rFonts w:ascii="Times New Roman" w:hAnsi="Times New Roman" w:eastAsia="宋体"/>
-          <w:b/>
-          <w:sz w:val="28"/>
-        </w:rPr>
-        <w:t>6.3 混淆矩阵</w:t>
+        <w:t>测试集混淆矩阵如图 4 所示。</w:t>
       </w:r>
     </w:p>
     <w:p>
@@ -2490,7 +2889,7 @@
       <w:r>
         <w:drawing>
           <wp:inline xmlns:a="http://schemas.openxmlformats.org/drawingml/2006/main" xmlns:pic="http://schemas.openxmlformats.org/drawingml/2006/picture">
-            <wp:extent cx="4754880" cy="3962400"/>
+            <wp:extent cx="4389120" cy="3657600"/>
             <wp:docPr id="4" name="Picture 4"/>
             <wp:cNvGraphicFramePr>
               <a:graphicFrameLocks noChangeAspect="1"/>
@@ -2511,7 +2910,7 @@
                   <pic:spPr>
                     <a:xfrm>
                       <a:off x="0" y="0"/>
-                      <a:ext cx="4754880" cy="3962400"/>
+                      <a:ext cx="4389120" cy="3657600"/>
                     </a:xfrm>
                     <a:prstGeom prst="rect"/>
                   </pic:spPr>
@@ -2524,49 +2923,44 @@
     </w:p>
     <w:p>
       <w:pPr>
+        <w:spacing w:before="40" w:after="120"/>
         <w:jc w:val="center"/>
       </w:pPr>
       <w:r>
         <w:rPr>
           <w:rFonts w:ascii="Times New Roman" w:hAnsi="Times New Roman" w:eastAsia="宋体"/>
-          <w:b w:val="0"/>
-          <w:i/>
+          <w:b/>
           <w:sz w:val="21"/>
         </w:rPr>
-        <w:t>图4 测试集混淆矩阵</w:t>
+        <w:t>图 4　测试集混淆矩阵</w:t>
       </w:r>
     </w:p>
     <w:p>
+      <w:pPr>
+        <w:spacing w:before="0" w:after="0" w:line="360" w:lineRule="auto"/>
+        <w:ind w:firstLine="480"/>
+      </w:pPr>
       <w:r>
         <w:rPr>
           <w:rFonts w:ascii="Times New Roman" w:hAnsi="Times New Roman" w:eastAsia="宋体"/>
           <w:b w:val="0"/>
           <w:sz w:val="24"/>
         </w:rPr>
-        <w:t>· 对角线元素占绝对多数，绝大部分样本被正确分类；</w:t>
+        <w:t>混淆矩阵对角线元素占绝对多数，说明绝大部分样本被正确分类；非对角线误分类数量极少，较易混淆的情形主要集中在形状相近的数字之间（如 5↔3、4↔9、7↔2），符合手写数字的直观特点。</w:t>
       </w:r>
     </w:p>
     <w:p>
+      <w:pPr>
+        <w:spacing w:before="0" w:after="0" w:line="360" w:lineRule="auto"/>
+        <w:ind w:firstLine="480"/>
+      </w:pPr>
       <w:r>
         <w:rPr>
           <w:rFonts w:ascii="Times New Roman" w:hAnsi="Times New Roman" w:eastAsia="宋体"/>
           <w:b w:val="0"/>
           <w:sz w:val="24"/>
         </w:rPr>
-        <w:t>· 误分类极少，主要集中在形状相近的数字之间（如 5↔3、4↔9、7↔2）。</w:t>
-      </w:r>
-    </w:p>
-    <w:p>
-      <w:pPr>
-        <w:pStyle w:val="Heading2"/>
-      </w:pPr>
-      <w:r>
-        <w:rPr>
-          <w:rFonts w:ascii="Times New Roman" w:hAnsi="Times New Roman" w:eastAsia="宋体"/>
-          <w:b/>
-          <w:sz w:val="28"/>
-        </w:rPr>
-        <w:t>6.4 预测示例</w:t>
+        <w:t>随机抽取的测试样本预测结果如图 5 所示（绿色标题表示预测正确）。</w:t>
       </w:r>
     </w:p>
     <w:p>
@@ -2576,7 +2970,7 @@
       <w:r>
         <w:drawing>
           <wp:inline xmlns:a="http://schemas.openxmlformats.org/drawingml/2006/main" xmlns:pic="http://schemas.openxmlformats.org/drawingml/2006/picture">
-            <wp:extent cx="5303520" cy="3977640"/>
+            <wp:extent cx="4937760" cy="3703320"/>
             <wp:docPr id="5" name="Picture 5"/>
             <wp:cNvGraphicFramePr>
               <a:graphicFrameLocks noChangeAspect="1"/>
@@ -2597,7 +2991,7 @@
                   <pic:spPr>
                     <a:xfrm>
                       <a:off x="0" y="0"/>
-                      <a:ext cx="5303520" cy="3977640"/>
+                      <a:ext cx="4937760" cy="3703320"/>
                     </a:xfrm>
                     <a:prstGeom prst="rect"/>
                   </pic:spPr>
@@ -2610,69 +3004,57 @@
     </w:p>
     <w:p>
       <w:pPr>
+        <w:spacing w:before="40" w:after="120"/>
         <w:jc w:val="center"/>
       </w:pPr>
       <w:r>
         <w:rPr>
           <w:rFonts w:ascii="Times New Roman" w:hAnsi="Times New Roman" w:eastAsia="宋体"/>
-          <w:b w:val="0"/>
-          <w:i/>
+          <w:b/>
           <w:sz w:val="21"/>
         </w:rPr>
-        <w:t>图5 测试样本预测示例（绿色=正确）</w:t>
+        <w:t>图 5　测试样本预测示例</w:t>
       </w:r>
     </w:p>
     <w:p>
       <w:pPr>
-        <w:pStyle w:val="Heading1"/>
+        <w:spacing w:before="120" w:after="120" w:line="360" w:lineRule="auto"/>
       </w:pPr>
       <w:r>
         <w:rPr>
           <w:rFonts w:ascii="Times New Roman" w:hAnsi="Times New Roman" w:eastAsia="宋体"/>
           <w:b/>
-          <w:sz w:val="32"/>
+          <w:sz w:val="28"/>
         </w:rPr>
-        <w:t>七、结论</w:t>
+        <w:t>6　小结</w:t>
       </w:r>
     </w:p>
     <w:p>
+      <w:pPr>
+        <w:spacing w:before="0" w:after="0" w:line="360" w:lineRule="auto"/>
+        <w:ind w:firstLine="480"/>
+      </w:pPr>
       <w:r>
         <w:rPr>
           <w:rFonts w:ascii="Times New Roman" w:hAnsi="Times New Roman" w:eastAsia="宋体"/>
           <w:b w:val="0"/>
           <w:sz w:val="24"/>
         </w:rPr>
-        <w:t>1. 基于 PyTorch 成功搭建了含 2 卷积层、2 池化层、2 全连接层的 CNN，完成 MNIST 识别任务；</w:t>
+        <w:t>本实验基于 PyTorch 成功搭建了一个包含 2 个卷积层、2 个池化层和 2 个全连接层的卷积神经网络，完成了 MNIST 手写数字识别任务。在 Epochs=10、batch_size=64、学习率=0.001、Adam 优化器、交叉熵损失的设置下，模型最终在 1 万张测试图片上达到 99.35%（最佳 99.36%）的识别精度。</w:t>
       </w:r>
     </w:p>
     <w:p>
+      <w:pPr>
+        <w:spacing w:before="0" w:after="0" w:line="360" w:lineRule="auto"/>
+        <w:ind w:firstLine="480"/>
+      </w:pPr>
       <w:r>
         <w:rPr>
           <w:rFonts w:ascii="Times New Roman" w:hAnsi="Times New Roman" w:eastAsia="宋体"/>
           <w:b w:val="0"/>
           <w:sz w:val="24"/>
         </w:rPr>
-        <w:t>2. 在 Epochs=10、batch_size=64、lr=0.001、Adam、交叉熵设置下，最终测试精度达 99.35%（最佳 99.36%）；</w:t>
-      </w:r>
-    </w:p>
-    <w:p>
-      <w:r>
-        <w:rPr>
-          <w:rFonts w:ascii="Times New Roman" w:hAnsi="Times New Roman" w:eastAsia="宋体"/>
-          <w:b w:val="0"/>
-          <w:sz w:val="24"/>
-        </w:rPr>
-        <w:t>3. CNN 通过卷积+池化自动提取空间特征，具有参数共享、平移不变、精度高的优势；</w:t>
-      </w:r>
-    </w:p>
-    <w:p>
-      <w:r>
-        <w:rPr>
-          <w:rFonts w:ascii="Times New Roman" w:hAnsi="Times New Roman" w:eastAsia="宋体"/>
-          <w:b w:val="0"/>
-          <w:sz w:val="24"/>
-        </w:rPr>
-        <w:t>4. 后续可尝试增加卷积层、加入 BatchNorm、数据增强或调整学习率以进一步提升性能。</w:t>
+        <w:t>实验表明，卷积神经网络通过卷积与池化自动提取图像的空间特征，相比全连接网络在图像任务上具有参数共享、平移不变、精度高的优势。后续可尝试增加卷积层数、加入 BatchNorm、引入数据增强或调整学习率等手段，以进一步提升模型精度或加快收敛速度。</w:t>
       </w:r>
     </w:p>
     <w:sectPr>

</xml_diff>